<commit_message>
Remove Dari column; fix Prekursor stray image; add table borders + fluid column widths
</commit_message>
<xml_diff>
--- a/templates/bmhp.docx
+++ b/templates/bmhp.docx
@@ -264,9 +264,17 @@
     </w:p>
     <w:tbl>
       <w:tblPr>
-        <w:tblW w:w="8806" w:type="dxa"/>
+        <w:tblW w:w="5000" w:type="pct"/>
         <w:tblInd w:w="93" w:type="dxa"/>
         <w:tblLook w:val="04A0" w:firstRow="1" w:lastRow="0" w:firstColumn="1" w:lastColumn="0" w:noHBand="0" w:noVBand="1"/>
+        <w:tblBorders>
+          <w:top w:val="single" w:sz="4" w:space="0" w:color="000000"/>
+          <w:left w:val="single" w:sz="4" w:space="0" w:color="000000"/>
+          <w:bottom w:val="single" w:sz="4" w:space="0" w:color="000000"/>
+          <w:right w:val="single" w:sz="4" w:space="0" w:color="000000"/>
+          <w:insideH w:val="single" w:sz="4" w:space="0" w:color="000000"/>
+          <w:insideV w:val="single" w:sz="4" w:space="0" w:color="000000"/>
+        </w:tblBorders>
       </w:tblPr>
       <w:tblGrid>
         <w:gridCol w:w="580"/>
@@ -281,7 +289,7 @@
         </w:trPr>
         <w:tc>
           <w:tcPr>
-            <w:tcW w:w="580" w:type="dxa"/>
+            <w:tcW w:w="300" w:type="pct"/>
             <w:tcBorders>
               <w:top w:val="single" w:sz="4" w:space="0" w:color="auto"/>
               <w:left w:val="single" w:sz="4" w:space="0" w:color="auto"/>
@@ -319,7 +327,7 @@
         </w:tc>
         <w:tc>
           <w:tcPr>
-            <w:tcW w:w="4397" w:type="dxa"/>
+            <w:tcW w:w="1900" w:type="pct"/>
             <w:tcBorders>
               <w:top w:val="single" w:sz="4" w:space="0" w:color="auto"/>
               <w:left w:val="nil"/>
@@ -357,7 +365,7 @@
         </w:tc>
         <w:tc>
           <w:tcPr>
-            <w:tcW w:w="1275" w:type="dxa"/>
+            <w:tcW w:w="700" w:type="pct"/>
             <w:tcBorders>
               <w:top w:val="single" w:sz="4" w:space="0" w:color="auto"/>
               <w:left w:val="nil"/>
@@ -395,7 +403,7 @@
         </w:tc>
         <w:tc>
           <w:tcPr>
-            <w:tcW w:w="1134" w:type="dxa"/>
+            <w:tcW w:w="600" w:type="pct"/>
             <w:tcBorders>
               <w:top w:val="single" w:sz="4" w:space="0" w:color="auto"/>
               <w:left w:val="nil"/>
@@ -433,7 +441,7 @@
         </w:tc>
         <w:tc>
           <w:tcPr>
-            <w:tcW w:w="1420" w:type="dxa"/>
+            <w:tcW w:w="1500" w:type="pct"/>
             <w:tcBorders>
               <w:top w:val="single" w:sz="4" w:space="0" w:color="auto"/>
               <w:left w:val="nil"/>
@@ -476,7 +484,7 @@
         </w:trPr>
         <w:tc>
           <w:tcPr>
-            <w:tcW w:w="580" w:type="dxa"/>
+            <w:tcW w:w="300" w:type="pct"/>
             <w:tcBorders>
               <w:top w:val="nil"/>
               <w:left w:val="single" w:sz="4" w:space="0" w:color="auto"/>
@@ -508,7 +516,7 @@
         </w:tc>
         <w:tc>
           <w:tcPr>
-            <w:tcW w:w="4397" w:type="dxa"/>
+            <w:tcW w:w="1900" w:type="pct"/>
             <w:tcBorders>
               <w:top w:val="nil"/>
               <w:left w:val="nil"/>
@@ -564,7 +572,7 @@
         </w:tc>
         <w:tc>
           <w:tcPr>
-            <w:tcW w:w="1275" w:type="dxa"/>
+            <w:tcW w:w="700" w:type="pct"/>
             <w:tcBorders>
               <w:top w:val="nil"/>
               <w:left w:val="nil"/>
@@ -598,7 +606,7 @@
         </w:tc>
         <w:tc>
           <w:tcPr>
-            <w:tcW w:w="1134" w:type="dxa"/>
+            <w:tcW w:w="600" w:type="pct"/>
             <w:tcBorders>
               <w:top w:val="nil"/>
               <w:left w:val="nil"/>
@@ -630,7 +638,7 @@
         </w:tc>
         <w:tc>
           <w:tcPr>
-            <w:tcW w:w="1420" w:type="dxa"/>
+            <w:tcW w:w="1500" w:type="pct"/>
             <w:tcBorders>
               <w:top w:val="nil"/>
               <w:left w:val="nil"/>

</xml_diff>